<commit_message>
Docs: CI passing on GitHub; refresh exports
</commit_message>
<xml_diff>
--- a/docs/exports/system-design.docx
+++ b/docs/exports/system-design.docx
@@ -105,19 +105,19 @@
         <w:t xml:space="preserve"> </w:t>
       </w:r>
       <w:r>
-        <w:t xml:space="preserve">rules, Alertmanager routing, Kubernetes manifests and GitHub workflows pass their official</w:t>
-      </w:r>
-      <w:r>
-        <w:t xml:space="preserve"> </w:t>
-      </w:r>
-      <w:r>
-        <w:t xml:space="preserve">validators. Not yet run anywhere: a real Kubernetes cluster, the Prometheus/Grafana/Loki</w:t>
-      </w:r>
-      <w:r>
-        <w:t xml:space="preserve"> </w:t>
-      </w:r>
-      <w:r>
-        <w:t xml:space="preserve">containers, and the GitHub Actions pipelines (they need your GitHub repo and hosting).</w:t>
+        <w:t xml:space="preserve">rules, Alertmanager routing and Kubernetes manifests pass their official validators, and the</w:t>
+      </w:r>
+      <w:r>
+        <w:t xml:space="preserve"> </w:t>
+      </w:r>
+      <w:r>
+        <w:t xml:space="preserve">GitHub Actions CI pipeline passes on GitHub. Not yet run: a real Kubernetes cluster, the</w:t>
+      </w:r>
+      <w:r>
+        <w:t xml:space="preserve"> </w:t>
+      </w:r>
+      <w:r>
+        <w:t xml:space="preserve">Prometheus/Grafana/Loki containers, and the deploy workflow (they need hosting).</w:t>
       </w:r>
       <w:r>
         <w:t xml:space="preserve"> </w:t>
@@ -7602,6 +7602,80 @@
           </w:p>
         </w:tc>
       </w:tr>
+      <w:tr>
+        <w:tc>
+          <w:tcPr/>
+          <w:p>
+            <w:pPr>
+              <w:pStyle w:val="Compact"/>
+            </w:pPr>
+            <w:r>
+              <w:t xml:space="preserve">First GitHub CI runs</w:t>
+            </w:r>
+          </w:p>
+        </w:tc>
+        <w:tc>
+          <w:tcPr/>
+          <w:p>
+            <w:pPr>
+              <w:pStyle w:val="Compact"/>
+            </w:pPr>
+            <w:r>
+              <w:t xml:space="preserve">Route types missing on a fresh checkout; mobile lock file broken on Linux; image names must be lowercase; Trivy found 3 fixable critical Perl CVEs in the base image</w:t>
+            </w:r>
+          </w:p>
+        </w:tc>
+        <w:tc>
+          <w:tcPr/>
+          <w:p>
+            <w:pPr>
+              <w:pStyle w:val="Compact"/>
+            </w:pPr>
+            <w:r>
+              <w:rPr>
+                <w:rStyle w:val="VerbatimChar"/>
+              </w:rPr>
+              <w:t xml:space="preserve">next typegen</w:t>
+            </w:r>
+            <w:r>
+              <w:t xml:space="preserve"> </w:t>
+            </w:r>
+            <w:r>
+              <w:t xml:space="preserve">before type-check; Linux-generated locks; lowercase</w:t>
+            </w:r>
+            <w:r>
+              <w:t xml:space="preserve"> </w:t>
+            </w:r>
+            <w:r>
+              <w:rPr>
+                <w:rStyle w:val="VerbatimChar"/>
+              </w:rPr>
+              <w:t xml:space="preserve">ghcr.io</w:t>
+            </w:r>
+            <w:r>
+              <w:t xml:space="preserve"> </w:t>
+            </w:r>
+            <w:r>
+              <w:t xml:space="preserve">names;</w:t>
+            </w:r>
+            <w:r>
+              <w:t xml:space="preserve"> </w:t>
+            </w:r>
+            <w:r>
+              <w:rPr>
+                <w:rStyle w:val="VerbatimChar"/>
+              </w:rPr>
+              <w:t xml:space="preserve">apt-get upgrade</w:t>
+            </w:r>
+            <w:r>
+              <w:t xml:space="preserve"> </w:t>
+            </w:r>
+            <w:r>
+              <w:t xml:space="preserve">in the image</w:t>
+            </w:r>
+          </w:p>
+        </w:tc>
+      </w:tr>
     </w:tbl>
     <w:p>
       <w:pPr>
@@ -8343,40 +8417,35 @@
               <w:pStyle w:val="Compact"/>
             </w:pPr>
             <w:r>
-              <w:t xml:space="preserve">GitHub Actions workflows</w:t>
-            </w:r>
-          </w:p>
-        </w:tc>
-        <w:tc>
-          <w:tcPr/>
-          <w:p>
-            <w:pPr>
-              <w:pStyle w:val="Compact"/>
-            </w:pPr>
-            <w:r>
-              <w:rPr>
-                <w:rStyle w:val="VerbatimChar"/>
-              </w:rPr>
-              <w:t xml:space="preserve">actionlint</w:t>
-            </w:r>
-            <w:r>
-              <w:t xml:space="preserve"> </w:t>
-            </w:r>
-            <w:r>
-              <w:t xml:space="preserve">passes; not yet run on GitHub</w:t>
-            </w:r>
-          </w:p>
-        </w:tc>
-      </w:tr>
-      <w:tr>
-        <w:tc>
-          <w:tcPr/>
-          <w:p>
-            <w:pPr>
-              <w:pStyle w:val="Compact"/>
-            </w:pPr>
-            <w:r>
-              <w:t xml:space="preserve">Real Kubernetes cluster, Prometheus/Grafana/Loki containers</w:t>
+              <w:t xml:space="preserve">GitHub Actions CI (quality, tests on Postgres, browser tests, image build + Trivy scan, push to GHCR)</w:t>
+            </w:r>
+          </w:p>
+        </w:tc>
+        <w:tc>
+          <w:tcPr/>
+          <w:p>
+            <w:pPr>
+              <w:pStyle w:val="Compact"/>
+            </w:pPr>
+            <w:r>
+              <w:rPr>
+                <w:b/>
+                <w:bCs/>
+              </w:rPr>
+              <w:t xml:space="preserve">Passing on GitHub</w:t>
+            </w:r>
+          </w:p>
+        </w:tc>
+      </w:tr>
+      <w:tr>
+        <w:tc>
+          <w:tcPr/>
+          <w:p>
+            <w:pPr>
+              <w:pStyle w:val="Compact"/>
+            </w:pPr>
+            <w:r>
+              <w:t xml:space="preserve">Real Kubernetes cluster, Prometheus/Grafana/Loki containers, deploy workflow</w:t>
             </w:r>
           </w:p>
         </w:tc>

</xml_diff>

<commit_message>
Add customer email confirmation, password reset and Google sign-in; rename the concierge to AI assistant; label the site as a demo
- Sign-up sends a confirmation link; saving is unlocked once the email is confirmed
- Forgot/reset password with single-use, expiring, hashed links; a reset signs out other sessions
- Continue with Google (OIDC, PKCE, state, nonce, verified ID token), shown only when configured
- Account emails are queued with the token and sent by the worker over SMTP (Mailpit locally)
- Concierge renamed to AI assistant in the site, portal, team app, code, docs and stored values
- Demo badge, footer note, page titles and noindex, switchable with SITE_DEMO
- Unit, integration and browser tests for the new flows; docs and exports updated
</commit_message>
<xml_diff>
--- a/docs/exports/system-design.docx
+++ b/docs/exports/system-design.docx
@@ -1605,7 +1605,7 @@
         <w:t xml:space="preserve"> </w:t>
       </w:r>
       <w:r>
-        <w:t xml:space="preserve">showings 8 per hour, concierge 30 per 10 min, ops assistant 60 per minute, Dual-Move share 5 per hour,</w:t>
+        <w:t xml:space="preserve">showings 8 per hour, AI assistant 30 per 10 min, ops assistant 60 per minute, Dual-Move share 5 per hour,</w:t>
       </w:r>
       <w:r>
         <w:t xml:space="preserve"> </w:t>
@@ -2774,6 +2774,49 @@
           <w:b/>
           <w:bCs/>
         </w:rPr>
+        <w:t xml:space="preserve">Emails</w:t>
+      </w:r>
+      <w:r>
+        <w:t xml:space="preserve"> </w:t>
+      </w:r>
+      <w:r>
+        <w:t xml:space="preserve">(</w:t>
+      </w:r>
+      <w:r>
+        <w:rPr>
+          <w:rStyle w:val="VerbatimChar"/>
+        </w:rPr>
+        <w:t xml:space="preserve">email.send</w:t>
+      </w:r>
+      <w:r>
+        <w:t xml:space="preserve">, 6 attempts): confirmation and password-reset emails are queued in the same</w:t>
+      </w:r>
+      <w:r>
+        <w:t xml:space="preserve"> </w:t>
+      </w:r>
+      <w:r>
+        <w:t xml:space="preserve">transaction that creates the token, so a link is never emailed for a rolled-back sign-up, and a mail</w:t>
+      </w:r>
+      <w:r>
+        <w:t xml:space="preserve"> </w:t>
+      </w:r>
+      <w:r>
+        <w:t xml:space="preserve">server outage only delays delivery.</w:t>
+      </w:r>
+    </w:p>
+    <w:p>
+      <w:pPr>
+        <w:pStyle w:val="Compact"/>
+        <w:numPr>
+          <w:ilvl w:val="0"/>
+          <w:numId w:val="1003"/>
+        </w:numPr>
+      </w:pPr>
+      <w:r>
+        <w:rPr>
+          <w:b/>
+          <w:bCs/>
+        </w:rPr>
         <w:t xml:space="preserve">Scheduler:</w:t>
       </w:r>
       <w:r>
@@ -3809,6 +3852,116 @@
           </w:p>
         </w:tc>
       </w:tr>
+      <w:tr>
+        <w:tc>
+          <w:tcPr/>
+          <w:p>
+            <w:pPr>
+              <w:pStyle w:val="Compact"/>
+            </w:pPr>
+            <w:r>
+              <w:t xml:space="preserve">SMTP (account emails)</w:t>
+            </w:r>
+          </w:p>
+        </w:tc>
+        <w:tc>
+          <w:tcPr/>
+          <w:p>
+            <w:pPr>
+              <w:pStyle w:val="Compact"/>
+            </w:pPr>
+            <w:r>
+              <w:rPr>
+                <w:rStyle w:val="VerbatimChar"/>
+              </w:rPr>
+              <w:t xml:space="preserve">smtp</w:t>
+            </w:r>
+          </w:p>
+        </w:tc>
+        <w:tc>
+          <w:tcPr/>
+          <w:p>
+            <w:pPr>
+              <w:pStyle w:val="Compact"/>
+            </w:pPr>
+            <w:r>
+              <w:t xml:space="preserve">5 / 60 s / 20 s</w:t>
+            </w:r>
+          </w:p>
+        </w:tc>
+        <w:tc>
+          <w:tcPr/>
+          <w:p>
+            <w:pPr>
+              <w:pStyle w:val="Compact"/>
+            </w:pPr>
+            <w:r>
+              <w:t xml:space="preserve">Email job retried later with backoff</w:t>
+            </w:r>
+          </w:p>
+        </w:tc>
+      </w:tr>
+      <w:tr>
+        <w:tc>
+          <w:tcPr/>
+          <w:p>
+            <w:pPr>
+              <w:pStyle w:val="Compact"/>
+            </w:pPr>
+            <w:r>
+              <w:t xml:space="preserve">Google sign-in token exchange</w:t>
+            </w:r>
+          </w:p>
+        </w:tc>
+        <w:tc>
+          <w:tcPr/>
+          <w:p>
+            <w:pPr>
+              <w:pStyle w:val="Compact"/>
+            </w:pPr>
+            <w:r>
+              <w:rPr>
+                <w:rStyle w:val="VerbatimChar"/>
+              </w:rPr>
+              <w:t xml:space="preserve">google</w:t>
+            </w:r>
+          </w:p>
+        </w:tc>
+        <w:tc>
+          <w:tcPr/>
+          <w:p>
+            <w:pPr>
+              <w:pStyle w:val="Compact"/>
+            </w:pPr>
+            <w:r>
+              <w:t xml:space="preserve">5 / 60 s / 10 s</w:t>
+            </w:r>
+          </w:p>
+        </w:tc>
+        <w:tc>
+          <w:tcPr/>
+          <w:p>
+            <w:pPr>
+              <w:pStyle w:val="Compact"/>
+            </w:pPr>
+            <w:r>
+              <w:t xml:space="preserve">Customer sees</w:t>
+            </w:r>
+            <w:r>
+              <w:t xml:space="preserve"> </w:t>
+            </w:r>
+            <w:r>
+              <w:t xml:space="preserve">“Google sign-in didn’t complete”</w:t>
+            </w:r>
+            <w:r>
+              <w:t xml:space="preserve"> </w:t>
+            </w:r>
+            <w:r>
+              <w:t xml:space="preserve">and can use email</w:t>
+            </w:r>
+          </w:p>
+        </w:tc>
+      </w:tr>
     </w:tbl>
     <w:p>
       <w:pPr>
@@ -4439,7 +4592,7 @@
               <w:pStyle w:val="Compact"/>
             </w:pPr>
             <w:r>
-              <w:t xml:space="preserve">Concierge fuzzy town match</w:t>
+              <w:t xml:space="preserve">AI assistant fuzzy town match</w:t>
             </w:r>
           </w:p>
         </w:tc>

</xml_diff>